<commit_message>
Hospital Management project &  necessary documents
</commit_message>
<xml_diff>
--- a/Documentation/pydantic_classes__&__use_of_annotated_we miss_annotated_in_project1_and_2.docx
+++ b/Documentation/pydantic_classes__&__use_of_annotated_we miss_annotated_in_project1_and_2.docx
@@ -17,7 +17,6 @@
           <w:highlight w:val="green"/>
         </w:rPr>
       </w:pPr>
-      <w:bookmarkStart w:id="0" w:name="_GoBack"/>
       <w:r>
         <w:rPr>
           <w:rFonts w:ascii="Times New Roman" w:eastAsia="Times New Roman" w:hAnsi="Times New Roman" w:cs="Times New Roman"/>
@@ -314,7 +313,7 @@
           <w:szCs w:val="24"/>
         </w:rPr>
         <w:pict>
-          <v:rect id="_x0000_i1053" style="width:0;height:1.5pt" o:hralign="center" o:hrstd="t" o:hr="t" fillcolor="#a0a0a0" stroked="f"/>
+          <v:rect id="_x0000_i1025" style="width:0;height:1.5pt" o:hralign="center" o:hrstd="t" o:hr="t" fillcolor="#a0a0a0" stroked="f"/>
         </w:pict>
       </w:r>
     </w:p>
@@ -1803,7 +1802,7 @@
           <w:szCs w:val="24"/>
         </w:rPr>
         <w:pict>
-          <v:rect id="_x0000_i1054" style="width:0;height:1.5pt" o:hralign="center" o:hrstd="t" o:hr="t" fillcolor="#a0a0a0" stroked="f"/>
+          <v:rect id="_x0000_i1026" style="width:0;height:1.5pt" o:hralign="center" o:hrstd="t" o:hr="t" fillcolor="#a0a0a0" stroked="f"/>
         </w:pict>
       </w:r>
     </w:p>
@@ -2595,7 +2594,7 @@
           <w:szCs w:val="24"/>
         </w:rPr>
         <w:pict>
-          <v:rect id="_x0000_i1055" style="width:0;height:1.5pt" o:hralign="center" o:hrstd="t" o:hr="t" fillcolor="#a0a0a0" stroked="f"/>
+          <v:rect id="_x0000_i1027" style="width:0;height:1.5pt" o:hralign="center" o:hrstd="t" o:hr="t" fillcolor="#a0a0a0" stroked="f"/>
         </w:pict>
       </w:r>
     </w:p>
@@ -3603,7 +3602,7 @@
           <w:szCs w:val="24"/>
         </w:rPr>
         <w:pict>
-          <v:rect id="_x0000_i1056" style="width:0;height:1.5pt" o:hralign="center" o:hrstd="t" o:hr="t" fillcolor="#a0a0a0" stroked="f"/>
+          <v:rect id="_x0000_i1028" style="width:0;height:1.5pt" o:hralign="center" o:hrstd="t" o:hr="t" fillcolor="#a0a0a0" stroked="f"/>
         </w:pict>
       </w:r>
     </w:p>
@@ -4329,7 +4328,7 @@
           <w:szCs w:val="24"/>
         </w:rPr>
         <w:pict>
-          <v:rect id="_x0000_i1057" style="width:0;height:1.5pt" o:hralign="center" o:hrstd="t" o:hr="t" fillcolor="#a0a0a0" stroked="f"/>
+          <v:rect id="_x0000_i1029" style="width:0;height:1.5pt" o:hralign="center" o:hrstd="t" o:hr="t" fillcolor="#a0a0a0" stroked="f"/>
         </w:pict>
       </w:r>
     </w:p>
@@ -4979,7 +4978,7 @@
           <w:szCs w:val="24"/>
         </w:rPr>
         <w:pict>
-          <v:rect id="_x0000_i1058" style="width:0;height:1.5pt" o:hralign="center" o:hrstd="t" o:hr="t" fillcolor="#a0a0a0" stroked="f"/>
+          <v:rect id="_x0000_i1030" style="width:0;height:1.5pt" o:hralign="center" o:hrstd="t" o:hr="t" fillcolor="#a0a0a0" stroked="f"/>
         </w:pict>
       </w:r>
     </w:p>
@@ -5720,7 +5719,7 @@
         </w:rPr>
         <w:lastRenderedPageBreak/>
         <w:pict>
-          <v:rect id="_x0000_i1059" style="width:0;height:1.5pt" o:hralign="center" o:hrstd="t" o:hr="t" fillcolor="#a0a0a0" stroked="f"/>
+          <v:rect id="_x0000_i1031" style="width:0;height:1.5pt" o:hralign="center" o:hrstd="t" o:hr="t" fillcolor="#a0a0a0" stroked="f"/>
         </w:pict>
       </w:r>
     </w:p>
@@ -6459,7 +6458,7 @@
           <w:szCs w:val="24"/>
         </w:rPr>
         <w:pict>
-          <v:rect id="_x0000_i1060" style="width:0;height:1.5pt" o:hralign="center" o:hrstd="t" o:hr="t" fillcolor="#a0a0a0" stroked="f"/>
+          <v:rect id="_x0000_i1032" style="width:0;height:1.5pt" o:hralign="center" o:hrstd="t" o:hr="t" fillcolor="#a0a0a0" stroked="f"/>
         </w:pict>
       </w:r>
     </w:p>
@@ -7073,7 +7072,7 @@
           <w:szCs w:val="24"/>
         </w:rPr>
         <w:pict>
-          <v:rect id="_x0000_i1061" style="width:0;height:1.5pt" o:hralign="center" o:hrstd="t" o:hr="t" fillcolor="#a0a0a0" stroked="f"/>
+          <v:rect id="_x0000_i1033" style="width:0;height:1.5pt" o:hralign="center" o:hrstd="t" o:hr="t" fillcolor="#a0a0a0" stroked="f"/>
         </w:pict>
       </w:r>
     </w:p>
@@ -7684,7 +7683,7 @@
           <w:szCs w:val="24"/>
         </w:rPr>
         <w:pict>
-          <v:rect id="_x0000_i1062" style="width:0;height:1.5pt" o:hralign="center" o:hrstd="t" o:hr="t" fillcolor="#a0a0a0" stroked="f"/>
+          <v:rect id="_x0000_i1034" style="width:0;height:1.5pt" o:hralign="center" o:hrstd="t" o:hr="t" fillcolor="#a0a0a0" stroked="f"/>
         </w:pict>
       </w:r>
     </w:p>
@@ -7802,7 +7801,7 @@
           <w:szCs w:val="24"/>
         </w:rPr>
         <w:pict>
-          <v:rect id="_x0000_i1063" style="width:0;height:1.5pt" o:hralign="center" o:hrstd="t" o:hr="t" fillcolor="#a0a0a0" stroked="f"/>
+          <v:rect id="_x0000_i1035" style="width:0;height:1.5pt" o:hralign="center" o:hrstd="t" o:hr="t" fillcolor="#a0a0a0" stroked="f"/>
         </w:pict>
       </w:r>
     </w:p>
@@ -8760,7 +8759,7 @@
           <w:szCs w:val="24"/>
         </w:rPr>
         <w:pict>
-          <v:rect id="_x0000_i1064" style="width:0;height:1.5pt" o:hralign="center" o:hrstd="t" o:hr="t" fillcolor="#a0a0a0" stroked="f"/>
+          <v:rect id="_x0000_i1036" style="width:0;height:1.5pt" o:hralign="center" o:hrstd="t" o:hr="t" fillcolor="#a0a0a0" stroked="f"/>
         </w:pict>
       </w:r>
     </w:p>
@@ -9468,7 +9467,7 @@
         </w:rPr>
         <w:lastRenderedPageBreak/>
         <w:pict>
-          <v:rect id="_x0000_i1065" style="width:0;height:1.5pt" o:hralign="center" o:hrstd="t" o:hr="t" fillcolor="#a0a0a0" stroked="f"/>
+          <v:rect id="_x0000_i1037" style="width:0;height:1.5pt" o:hralign="center" o:hrstd="t" o:hr="t" fillcolor="#a0a0a0" stroked="f"/>
         </w:pict>
       </w:r>
     </w:p>
@@ -9756,7 +9755,7 @@
           <w:szCs w:val="24"/>
         </w:rPr>
         <w:pict>
-          <v:rect id="_x0000_i1066" style="width:0;height:1.5pt" o:hralign="center" o:hrstd="t" o:hr="t" fillcolor="#a0a0a0" stroked="f"/>
+          <v:rect id="_x0000_i1038" style="width:0;height:1.5pt" o:hralign="center" o:hrstd="t" o:hr="t" fillcolor="#a0a0a0" stroked="f"/>
         </w:pict>
       </w:r>
     </w:p>
@@ -10446,7 +10445,7 @@
           <w:szCs w:val="24"/>
         </w:rPr>
         <w:pict>
-          <v:rect id="_x0000_i1067" style="width:0;height:1.5pt" o:hralign="center" o:hrstd="t" o:hr="t" fillcolor="#a0a0a0" stroked="f"/>
+          <v:rect id="_x0000_i1039" style="width:0;height:1.5pt" o:hralign="center" o:hrstd="t" o:hr="t" fillcolor="#a0a0a0" stroked="f"/>
         </w:pict>
       </w:r>
     </w:p>
@@ -10653,7 +10652,7 @@
           <w:szCs w:val="24"/>
         </w:rPr>
         <w:pict>
-          <v:rect id="_x0000_i1068" style="width:0;height:1.5pt" o:hralign="center" o:hrstd="t" o:hr="t" fillcolor="#a0a0a0" stroked="f"/>
+          <v:rect id="_x0000_i1040" style="width:0;height:1.5pt" o:hralign="center" o:hrstd="t" o:hr="t" fillcolor="#a0a0a0" stroked="f"/>
         </w:pict>
       </w:r>
     </w:p>
@@ -10816,7 +10815,7 @@
           <w:szCs w:val="24"/>
         </w:rPr>
         <w:pict>
-          <v:rect id="_x0000_i1069" style="width:0;height:1.5pt" o:hralign="center" o:hrstd="t" o:hr="t" fillcolor="#a0a0a0" stroked="f"/>
+          <v:rect id="_x0000_i1041" style="width:0;height:1.5pt" o:hralign="center" o:hrstd="t" o:hr="t" fillcolor="#a0a0a0" stroked="f"/>
         </w:pict>
       </w:r>
     </w:p>
@@ -11069,7 +11068,7 @@
           <w:szCs w:val="24"/>
         </w:rPr>
         <w:pict>
-          <v:rect id="_x0000_i1070" style="width:0;height:1.5pt" o:hralign="center" o:hrstd="t" o:hr="t" fillcolor="#a0a0a0" stroked="f"/>
+          <v:rect id="_x0000_i1042" style="width:0;height:1.5pt" o:hralign="center" o:hrstd="t" o:hr="t" fillcolor="#a0a0a0" stroked="f"/>
         </w:pict>
       </w:r>
     </w:p>
@@ -11169,7 +11168,7 @@
           <w:szCs w:val="24"/>
         </w:rPr>
         <w:pict>
-          <v:rect id="_x0000_i1071" style="width:0;height:1.5pt" o:hralign="center" o:hrstd="t" o:hr="t" fillcolor="#a0a0a0" stroked="f"/>
+          <v:rect id="_x0000_i1043" style="width:0;height:1.5pt" o:hralign="center" o:hrstd="t" o:hr="t" fillcolor="#a0a0a0" stroked="f"/>
         </w:pict>
       </w:r>
     </w:p>
@@ -11350,7 +11349,7 @@
           <w:szCs w:val="24"/>
         </w:rPr>
         <w:pict>
-          <v:rect id="_x0000_i1072" style="width:0;height:1.5pt" o:hralign="center" o:hrstd="t" o:hr="t" fillcolor="#a0a0a0" stroked="f"/>
+          <v:rect id="_x0000_i1044" style="width:0;height:1.5pt" o:hralign="center" o:hrstd="t" o:hr="t" fillcolor="#a0a0a0" stroked="f"/>
         </w:pict>
       </w:r>
     </w:p>
@@ -12182,7 +12181,7 @@
           <w:szCs w:val="24"/>
         </w:rPr>
         <w:pict>
-          <v:rect id="_x0000_i1073" style="width:0;height:1.5pt" o:hralign="center" o:hrstd="t" o:hr="t" fillcolor="#a0a0a0" stroked="f"/>
+          <v:rect id="_x0000_i1045" style="width:0;height:1.5pt" o:hralign="center" o:hrstd="t" o:hr="t" fillcolor="#a0a0a0" stroked="f"/>
         </w:pict>
       </w:r>
     </w:p>
@@ -12773,7 +12772,7 @@
           <w:szCs w:val="24"/>
         </w:rPr>
         <w:pict>
-          <v:rect id="_x0000_i1074" style="width:0;height:1.5pt" o:hralign="center" o:hrstd="t" o:hr="t" fillcolor="#a0a0a0" stroked="f"/>
+          <v:rect id="_x0000_i1046" style="width:0;height:1.5pt" o:hralign="center" o:hrstd="t" o:hr="t" fillcolor="#a0a0a0" stroked="f"/>
         </w:pict>
       </w:r>
     </w:p>
@@ -12962,7 +12961,7 @@
           <w:szCs w:val="24"/>
         </w:rPr>
         <w:pict>
-          <v:rect id="_x0000_i1075" style="width:0;height:1.5pt" o:hralign="center" o:hrstd="t" o:hr="t" fillcolor="#a0a0a0" stroked="f"/>
+          <v:rect id="_x0000_i1047" style="width:0;height:1.5pt" o:hralign="center" o:hrstd="t" o:hr="t" fillcolor="#a0a0a0" stroked="f"/>
         </w:pict>
       </w:r>
     </w:p>
@@ -13607,7 +13606,7 @@
           <w:szCs w:val="24"/>
         </w:rPr>
         <w:pict>
-          <v:rect id="_x0000_i1025" style="width:0;height:1.5pt" o:hralign="center" o:hrstd="t" o:hr="t" fillcolor="#a0a0a0" stroked="f"/>
+          <v:rect id="_x0000_i1048" style="width:0;height:1.5pt" o:hralign="center" o:hrstd="t" o:hr="t" fillcolor="#a0a0a0" stroked="f"/>
         </w:pict>
       </w:r>
     </w:p>
@@ -13854,7 +13853,7 @@
           <w:szCs w:val="24"/>
         </w:rPr>
         <w:pict>
-          <v:rect id="_x0000_i1026" style="width:0;height:1.5pt" o:hralign="center" o:hrstd="t" o:hr="t" fillcolor="#a0a0a0" stroked="f"/>
+          <v:rect id="_x0000_i1049" style="width:0;height:1.5pt" o:hralign="center" o:hrstd="t" o:hr="t" fillcolor="#a0a0a0" stroked="f"/>
         </w:pict>
       </w:r>
     </w:p>
@@ -14640,7 +14639,7 @@
         </w:rPr>
         <w:lastRenderedPageBreak/>
         <w:pict>
-          <v:rect id="_x0000_i1027" style="width:0;height:1.5pt" o:hralign="center" o:hrstd="t" o:hr="t" fillcolor="#a0a0a0" stroked="f"/>
+          <v:rect id="_x0000_i1050" style="width:0;height:1.5pt" o:hralign="center" o:hrstd="t" o:hr="t" fillcolor="#a0a0a0" stroked="f"/>
         </w:pict>
       </w:r>
     </w:p>
@@ -15609,7 +15608,7 @@
           <w:szCs w:val="24"/>
         </w:rPr>
         <w:pict>
-          <v:rect id="_x0000_i1028" style="width:0;height:1.5pt" o:hralign="center" o:hrstd="t" o:hr="t" fillcolor="#a0a0a0" stroked="f"/>
+          <v:rect id="_x0000_i1051" style="width:0;height:1.5pt" o:hralign="center" o:hrstd="t" o:hr="t" fillcolor="#a0a0a0" stroked="f"/>
         </w:pict>
       </w:r>
     </w:p>
@@ -16882,7 +16881,7 @@
           <w:szCs w:val="24"/>
         </w:rPr>
         <w:pict>
-          <v:rect id="_x0000_i1029" style="width:0;height:1.5pt" o:hralign="center" o:hrstd="t" o:hr="t" fillcolor="#a0a0a0" stroked="f"/>
+          <v:rect id="_x0000_i1052" style="width:0;height:1.5pt" o:hralign="center" o:hrstd="t" o:hr="t" fillcolor="#a0a0a0" stroked="f"/>
         </w:pict>
       </w:r>
     </w:p>
@@ -17802,7 +17801,7 @@
           <w:szCs w:val="24"/>
         </w:rPr>
         <w:pict>
-          <v:rect id="_x0000_i1030" style="width:0;height:1.5pt" o:hralign="center" o:hrstd="t" o:hr="t" fillcolor="#a0a0a0" stroked="f"/>
+          <v:rect id="_x0000_i1053" style="width:0;height:1.5pt" o:hralign="center" o:hrstd="t" o:hr="t" fillcolor="#a0a0a0" stroked="f"/>
         </w:pict>
       </w:r>
     </w:p>
@@ -18738,7 +18737,7 @@
           <w:szCs w:val="24"/>
         </w:rPr>
         <w:pict>
-          <v:rect id="_x0000_i1031" style="width:0;height:1.5pt" o:hralign="center" o:hrstd="t" o:hr="t" fillcolor="#a0a0a0" stroked="f"/>
+          <v:rect id="_x0000_i1054" style="width:0;height:1.5pt" o:hralign="center" o:hrstd="t" o:hr="t" fillcolor="#a0a0a0" stroked="f"/>
         </w:pict>
       </w:r>
     </w:p>
@@ -19171,7 +19170,7 @@
           <w:szCs w:val="24"/>
         </w:rPr>
         <w:pict>
-          <v:rect id="_x0000_i1032" style="width:0;height:1.5pt" o:hralign="center" o:hrstd="t" o:hr="t" fillcolor="#a0a0a0" stroked="f"/>
+          <v:rect id="_x0000_i1055" style="width:0;height:1.5pt" o:hralign="center" o:hrstd="t" o:hr="t" fillcolor="#a0a0a0" stroked="f"/>
         </w:pict>
       </w:r>
     </w:p>
@@ -19350,7 +19349,7 @@
         </w:rPr>
         <w:lastRenderedPageBreak/>
         <w:pict>
-          <v:rect id="_x0000_i1033" style="width:0;height:1.5pt" o:hralign="center" o:hrstd="t" o:hr="t" fillcolor="#a0a0a0" stroked="f"/>
+          <v:rect id="_x0000_i1056" style="width:0;height:1.5pt" o:hralign="center" o:hrstd="t" o:hr="t" fillcolor="#a0a0a0" stroked="f"/>
         </w:pict>
       </w:r>
     </w:p>
@@ -19477,7 +19476,7 @@
           <w:szCs w:val="24"/>
         </w:rPr>
         <w:pict>
-          <v:rect id="_x0000_i1034" style="width:0;height:1.5pt" o:hralign="center" o:hrstd="t" o:hr="t" fillcolor="#a0a0a0" stroked="f"/>
+          <v:rect id="_x0000_i1057" style="width:0;height:1.5pt" o:hralign="center" o:hrstd="t" o:hr="t" fillcolor="#a0a0a0" stroked="f"/>
         </w:pict>
       </w:r>
     </w:p>
@@ -19574,7 +19573,7 @@
           <w:szCs w:val="24"/>
         </w:rPr>
         <w:pict>
-          <v:rect id="_x0000_i1035" style="width:0;height:1.5pt" o:hralign="center" o:hrstd="t" o:hr="t" fillcolor="#a0a0a0" stroked="f"/>
+          <v:rect id="_x0000_i1058" style="width:0;height:1.5pt" o:hralign="center" o:hrstd="t" o:hr="t" fillcolor="#a0a0a0" stroked="f"/>
         </w:pict>
       </w:r>
     </w:p>
@@ -19661,7 +19660,7 @@
           <w:szCs w:val="24"/>
         </w:rPr>
         <w:pict>
-          <v:rect id="_x0000_i1036" style="width:0;height:1.5pt" o:hralign="center" o:hrstd="t" o:hr="t" fillcolor="#a0a0a0" stroked="f"/>
+          <v:rect id="_x0000_i1059" style="width:0;height:1.5pt" o:hralign="center" o:hrstd="t" o:hr="t" fillcolor="#a0a0a0" stroked="f"/>
         </w:pict>
       </w:r>
     </w:p>
@@ -20054,7 +20053,7 @@
           <w:szCs w:val="24"/>
         </w:rPr>
         <w:pict>
-          <v:rect id="_x0000_i1037" style="width:0;height:1.5pt" o:hralign="center" o:hrstd="t" o:hr="t" fillcolor="#a0a0a0" stroked="f"/>
+          <v:rect id="_x0000_i1060" style="width:0;height:1.5pt" o:hralign="center" o:hrstd="t" o:hr="t" fillcolor="#a0a0a0" stroked="f"/>
         </w:pict>
       </w:r>
     </w:p>
@@ -20324,7 +20323,7 @@
           <w:szCs w:val="24"/>
         </w:rPr>
         <w:pict>
-          <v:rect id="_x0000_i1038" style="width:0;height:1.5pt" o:hralign="center" o:hrstd="t" o:hr="t" fillcolor="#a0a0a0" stroked="f"/>
+          <v:rect id="_x0000_i1061" style="width:0;height:1.5pt" o:hralign="center" o:hrstd="t" o:hr="t" fillcolor="#a0a0a0" stroked="f"/>
         </w:pict>
       </w:r>
     </w:p>
@@ -20824,7 +20823,7 @@
           <w:szCs w:val="24"/>
         </w:rPr>
         <w:pict>
-          <v:rect id="_x0000_i1099" style="width:0;height:1.5pt" o:hralign="center" o:hrstd="t" o:hr="t" fillcolor="#a0a0a0" stroked="f"/>
+          <v:rect id="_x0000_i1062" style="width:0;height:1.5pt" o:hralign="center" o:hrstd="t" o:hr="t" fillcolor="#a0a0a0" stroked="f"/>
         </w:pict>
       </w:r>
     </w:p>
@@ -21282,7 +21281,7 @@
           <w:szCs w:val="24"/>
         </w:rPr>
         <w:pict>
-          <v:rect id="_x0000_i1100" style="width:0;height:1.5pt" o:hralign="center" o:hrstd="t" o:hr="t" fillcolor="#a0a0a0" stroked="f"/>
+          <v:rect id="_x0000_i1063" style="width:0;height:1.5pt" o:hralign="center" o:hrstd="t" o:hr="t" fillcolor="#a0a0a0" stroked="f"/>
         </w:pict>
       </w:r>
     </w:p>
@@ -22711,7 +22710,7 @@
           <w:szCs w:val="24"/>
         </w:rPr>
         <w:pict>
-          <v:rect id="_x0000_i1101" style="width:0;height:1.5pt" o:hralign="center" o:hrstd="t" o:hr="t" fillcolor="#a0a0a0" stroked="f"/>
+          <v:rect id="_x0000_i1064" style="width:0;height:1.5pt" o:hralign="center" o:hrstd="t" o:hr="t" fillcolor="#a0a0a0" stroked="f"/>
         </w:pict>
       </w:r>
     </w:p>
@@ -23464,7 +23463,7 @@
           <w:szCs w:val="24"/>
         </w:rPr>
         <w:pict>
-          <v:rect id="_x0000_i1102" style="width:0;height:1.5pt" o:hralign="center" o:hrstd="t" o:hr="t" fillcolor="#a0a0a0" stroked="f"/>
+          <v:rect id="_x0000_i1065" style="width:0;height:1.5pt" o:hralign="center" o:hrstd="t" o:hr="t" fillcolor="#a0a0a0" stroked="f"/>
         </w:pict>
       </w:r>
     </w:p>
@@ -25472,7 +25471,7 @@
           <w:szCs w:val="24"/>
         </w:rPr>
         <w:pict>
-          <v:rect id="_x0000_i1103" style="width:0;height:1.5pt" o:hralign="center" o:hrstd="t" o:hr="t" fillcolor="#a0a0a0" stroked="f"/>
+          <v:rect id="_x0000_i1066" style="width:0;height:1.5pt" o:hralign="center" o:hrstd="t" o:hr="t" fillcolor="#a0a0a0" stroked="f"/>
         </w:pict>
       </w:r>
     </w:p>
@@ -25914,7 +25913,7 @@
         </w:rPr>
         <w:lastRenderedPageBreak/>
         <w:pict>
-          <v:rect id="_x0000_i1104" style="width:0;height:1.5pt" o:hralign="center" o:hrstd="t" o:hr="t" fillcolor="#a0a0a0" stroked="f"/>
+          <v:rect id="_x0000_i1067" style="width:0;height:1.5pt" o:hralign="center" o:hrstd="t" o:hr="t" fillcolor="#a0a0a0" stroked="f"/>
         </w:pict>
       </w:r>
     </w:p>
@@ -26277,7 +26276,7 @@
           <w:szCs w:val="24"/>
         </w:rPr>
         <w:pict>
-          <v:rect id="_x0000_i1105" style="width:0;height:1.5pt" o:hralign="center" o:hrstd="t" o:hr="t" fillcolor="#a0a0a0" stroked="f"/>
+          <v:rect id="_x0000_i1068" style="width:0;height:1.5pt" o:hralign="center" o:hrstd="t" o:hr="t" fillcolor="#a0a0a0" stroked="f"/>
         </w:pict>
       </w:r>
     </w:p>
@@ -26352,7 +26351,7 @@
           <w:szCs w:val="24"/>
         </w:rPr>
         <w:pict>
-          <v:rect id="_x0000_i1106" style="width:0;height:1.5pt" o:hralign="center" o:hrstd="t" o:hr="t" fillcolor="#a0a0a0" stroked="f"/>
+          <v:rect id="_x0000_i1069" style="width:0;height:1.5pt" o:hralign="center" o:hrstd="t" o:hr="t" fillcolor="#a0a0a0" stroked="f"/>
         </w:pict>
       </w:r>
     </w:p>
@@ -26369,6 +26368,8 @@
           <w:szCs w:val="48"/>
         </w:rPr>
       </w:pPr>
+      <w:bookmarkStart w:id="0" w:name="_GoBack"/>
+      <w:bookmarkEnd w:id="0"/>
       <w:r>
         <w:rPr>
           <w:rFonts w:ascii="Times New Roman" w:eastAsia="Times New Roman" w:hAnsi="Times New Roman" w:cs="Times New Roman"/>
@@ -26377,6 +26378,7 @@
           <w:kern w:val="36"/>
           <w:sz w:val="48"/>
           <w:szCs w:val="48"/>
+          <w:highlight w:val="yellow"/>
         </w:rPr>
         <w:t xml:space="preserve">8️ Endpoint Using </w:t>
       </w:r>
@@ -26388,6 +26390,7 @@
           <w:kern w:val="36"/>
           <w:sz w:val="20"/>
           <w:szCs w:val="20"/>
+          <w:highlight w:val="yellow"/>
         </w:rPr>
         <w:t>Annotated</w:t>
       </w:r>
@@ -26399,6 +26402,7 @@
           <w:kern w:val="36"/>
           <w:sz w:val="48"/>
           <w:szCs w:val="48"/>
+          <w:highlight w:val="yellow"/>
         </w:rPr>
         <w:t xml:space="preserve"> (Clean Version)</w:t>
       </w:r>
@@ -26988,7 +26992,7 @@
           <w:szCs w:val="24"/>
         </w:rPr>
         <w:pict>
-          <v:rect id="_x0000_i1107" style="width:0;height:1.5pt" o:hralign="center" o:hrstd="t" o:hr="t" fillcolor="#a0a0a0" stroked="f"/>
+          <v:rect id="_x0000_i1070" style="width:0;height:1.5pt" o:hralign="center" o:hrstd="t" o:hr="t" fillcolor="#a0a0a0" stroked="f"/>
         </w:pict>
       </w:r>
     </w:p>
@@ -28042,7 +28046,7 @@
           <w:szCs w:val="24"/>
         </w:rPr>
         <w:pict>
-          <v:rect id="_x0000_i1108" style="width:0;height:1.5pt" o:hralign="center" o:hrstd="t" o:hr="t" fillcolor="#a0a0a0" stroked="f"/>
+          <v:rect id="_x0000_i1071" style="width:0;height:1.5pt" o:hralign="center" o:hrstd="t" o:hr="t" fillcolor="#a0a0a0" stroked="f"/>
         </w:pict>
       </w:r>
     </w:p>
@@ -28992,7 +28996,7 @@
           <w:szCs w:val="24"/>
         </w:rPr>
         <w:pict>
-          <v:rect id="_x0000_i1109" style="width:0;height:1.5pt" o:hralign="center" o:hrstd="t" o:hr="t" fillcolor="#a0a0a0" stroked="f"/>
+          <v:rect id="_x0000_i1072" style="width:0;height:1.5pt" o:hralign="center" o:hrstd="t" o:hr="t" fillcolor="#a0a0a0" stroked="f"/>
         </w:pict>
       </w:r>
     </w:p>
@@ -29260,7 +29264,7 @@
           <w:szCs w:val="24"/>
         </w:rPr>
         <w:pict>
-          <v:rect id="_x0000_i1110" style="width:0;height:1.5pt" o:hralign="center" o:hrstd="t" o:hr="t" fillcolor="#a0a0a0" stroked="f"/>
+          <v:rect id="_x0000_i1073" style="width:0;height:1.5pt" o:hralign="center" o:hrstd="t" o:hr="t" fillcolor="#a0a0a0" stroked="f"/>
         </w:pict>
       </w:r>
     </w:p>
@@ -29658,7 +29662,7 @@
           <w:szCs w:val="24"/>
         </w:rPr>
         <w:pict>
-          <v:rect id="_x0000_i1111" style="width:0;height:1.5pt" o:hralign="center" o:hrstd="t" o:hr="t" fillcolor="#a0a0a0" stroked="f"/>
+          <v:rect id="_x0000_i1074" style="width:0;height:1.5pt" o:hralign="center" o:hrstd="t" o:hr="t" fillcolor="#a0a0a0" stroked="f"/>
         </w:pict>
       </w:r>
     </w:p>
@@ -30112,7 +30116,7 @@
           <w:szCs w:val="24"/>
         </w:rPr>
         <w:pict>
-          <v:rect id="_x0000_i1112" style="width:0;height:1.5pt" o:hralign="center" o:hrstd="t" o:hr="t" fillcolor="#a0a0a0" stroked="f"/>
+          <v:rect id="_x0000_i1075" style="width:0;height:1.5pt" o:hralign="center" o:hrstd="t" o:hr="t" fillcolor="#a0a0a0" stroked="f"/>
         </w:pict>
       </w:r>
     </w:p>
@@ -30260,7 +30264,6 @@
         <w:t>.</w:t>
       </w:r>
     </w:p>
-    <w:bookmarkEnd w:id="0"/>
     <w:p/>
     <w:sectPr>
       <w:pgSz w:w="12240" w:h="15840"/>

</xml_diff>